<commit_message>
completed the core features for the rsmi writer
</commit_message>
<xml_diff>
--- a/src/static/media/Appendix_64.docx
+++ b/src/static/media/Appendix_64.docx
@@ -98,7 +98,6 @@
             <w:insideH w:val="none" w:color="auto" w:sz="0" w:space="0"/>
             <w:insideV w:val="none" w:color="auto" w:sz="0" w:space="0"/>
           </w:tblBorders>
-          <w:shd w:val="clear" w:color="auto" w:fill="auto"/>
           <w:tblCellMar>
             <w:top w:w="0" w:type="dxa"/>
             <w:left w:w="108" w:type="dxa"/>
@@ -157,7 +156,17 @@
                 <w:rFonts w:hint="default" w:ascii="Arial" w:hAnsi="Arial" w:eastAsia="SimSun" w:cs="Arial"/>
                 <w:lang w:val="en-PH" w:eastAsia="zh-CN" w:bidi="ar"/>
               </w:rPr>
-              <w:t>{{agency_name}}</w:t>
+              <w:t>{{agency_name</w:t>
+            </w:r>
+            <w:bookmarkStart w:id="0" w:name="_GoBack"/>
+            <w:bookmarkEnd w:id="0"/>
+            <w:r>
+              <w:rPr>
+                <w:rStyle w:val="6"/>
+                <w:rFonts w:hint="default" w:ascii="Arial" w:hAnsi="Arial" w:eastAsia="SimSun" w:cs="Arial"/>
+                <w:lang w:val="en-PH" w:eastAsia="zh-CN" w:bidi="ar"/>
+              </w:rPr>
+              <w:t>}}</w:t>
             </w:r>
           </w:p>
         </w:tc>
@@ -286,8 +295,6 @@
               </w:rPr>
               <w:t>{{fund_cluster}}</w:t>
             </w:r>
-            <w:bookmarkStart w:id="0" w:name="_GoBack"/>
-            <w:bookmarkEnd w:id="0"/>
           </w:p>
         </w:tc>
         <w:tc>

</xml_diff>